<commit_message>
exam_conf.py and hallticket.py completed
</commit_message>
<xml_diff>
--- a/ERP/pre_exam/00-overview.docx
+++ b/ERP/pre_exam/00-overview.docx
@@ -1217,7 +1217,7 @@
           </w:tcPr>
           <w:p>
             <w:r>
-              <w:t>coming next</w:t>
+              <w:t>✅ Complete</w:t>
             </w:r>
           </w:p>
         </w:tc>
@@ -1259,7 +1259,7 @@
           </w:tcPr>
           <w:p>
             <w:r>
-              <w:t>coming next</w:t>
+              <w:t>✅ Complete</w:t>
             </w:r>
           </w:p>
         </w:tc>
@@ -1496,6 +1496,16 @@
     <w:p>
       <w:r>
         <w:t>Update after project_lab_mark.py (22 of 26 modules now complete). This file supplied the app's most consequential false-success bug: PLVFMarkPublish's nested, exception-driven approval workflow has a branch with no return at all, so a failed approval attempt for a non-"Section Officer" user can fall through to the method's final line and report success even though nothing was actually approved. It also quadrupled the count of "false paired with HTTP 201" responses (three occurrences in PLVFMarkEntryUpload alone, on top of question_paper.py's original one) and supplied a second confirmed IndexError-on-the-ordinary-case bug (FetchProjectMarks, indexing [0] into a list that is empty exactly when a student simply has no marks yet). ProjectMarkSave performs four separate writes with no transaction: two bulk status updates can commit even when the two IndexError-prone steps that follow them crash, leaving a student's registration status changed with no mark record created. StudentsList also has a developer-disabled duplicate-prevention check, left commented out with a note saying it should be re-enabled. See project_lab_mark.docx for full detail.</w:t>
+      </w:r>
+    </w:p>
+    <w:p>
+      <w:r>
+        <w:t>Update after hallticket.py (23 of 26 modules now complete). This file supplied two more confirmed instances of the disabled-safety-check pattern (an exam-schedule approval check and a hall-ticket publish deadline, each computed and then never actually compared because the real if-condition is commented out) -- three across the app now. It also introduced a new confirmed anti-pattern -- signalling "not found" via success:true plus a separate string flag (htl_data) rather than the envelope's own success:false, matching a pattern already seen in nominal_role.py -- and a likely-broken endpoint (PrgmwiseColleges) that filters ProgrammeSemester by a field named after the model itself, unlike its correctly-written neighbour. Four separate endpoints share one unguarded double-index-into-serialized-data crash risk. This app's second confirmed AllowAny endpoint (PrgmwiseSchemeList) was also found here. See hallticket.docx for full detail.</w:t>
+      </w:r>
+    </w:p>
+    <w:p>
+      <w:r>
+        <w:t>Update after exam_conf.py (24 of 26 modules now complete). This is the app's largest and most heavily churned file: it holds by far the biggest volume of commented-out dead code seen anywhere (three full alternate class definitions, a ~35-line disabled exam-creation flow, two ~38-line disabled dropdown-rebuilding blocks), and two of those dead blocks are confirmed evidence of real response-content regressions — ExamConfiguration.get and ExamList/ExamExtendList's POST methods all used to return fields (an exam_list, or the category dropdown lists) that the live code no longer includes. The django-river workflow engine's `.approve()` call is commented out in all EIGHT state-transition endpoints that have one, leaving several `except RiverException` handlers permanently unreachable — a deliberate, file-wide bypass rather than an isolated oversight. Two endpoints (PrgmwiseSchemeList, SchemeSemList) filter a master table's name/title field using a value read from a parameter explicitly named as an id, very likely making both return empty results on every real call. ExamExtendList's GET and POST methods assign a different status label for the identical business condition. Examedit.post has two confirmed IndexError risks from unguarded list-filter-then-[0] calls, positioned after other rows in the same multi-row, non-transactional update have already been written. This file alone adds 4 more "missing exception handling entirely" instances and a 4th confirmed unwrapped-unique_everseen occurrence (in a new variant: the list() wraps the input, not the output). See exam_conf.docx for full detail.</w:t>
       </w:r>
     </w:p>
     <w:sectPr>

</xml_diff>